<commit_message>
Abstract: submitted version (Amlan Sarkar's revision) in the template
Co-Authored-By: Claude Opus 5.5 <noreply@anthropic.com>
</commit_message>
<xml_diff>
--- a/chapter/CAB_Sepsis_Abstract.docx
+++ b/chapter/CAB_Sepsis_Abstract.docx
@@ -186,7 +186,7 @@
           <w:szCs w:val="24"/>
           <w:lang w:val="en-AU"/>
         </w:rPr>
-        <w:t xml:space="preserve"> Hospitals increasingly deploy clinical prediction models developed elsewhere, yet performance often degrades after transfer, and receiving hospitals lack a principled way to decide whether to recalibrate, adapt or abandon an imported model.</w:t>
+        <w:t xml:space="preserve"> Clinical prediction models often lose performance when transferred to new hospitals or clinical units, yet receiving institutions lack a statistically grounded approach to determining whether an imported model can be deployed safely, requires updating, or should be rejected.</w:t>
       </w:r>
       <w:r>
         <w:rPr>
@@ -212,7 +212,7 @@
           <w:szCs w:val="24"/>
           <w:lang w:val="en-AU"/>
         </w:rPr>
-        <w:t xml:space="preserve"> This research aims to develop a deployment gate that uses a small number of locally labelled patients to choose the least invasive safe option for an imported sepsis early-warning model, while bounding the risk of activating an unsafe model.</w:t>
+        <w:t xml:space="preserve"> This study proposes CAB (Calibrate, Adapt, or Block), a statistically certified deployment gate that uses locally labelled patient data to select the least invasive acceptable intervention for an imported sepsis early-warning model while controlling the risk of activating a model that fails prespecified safety requirements.</w:t>
       </w:r>
       <w:r>
         <w:rPr>
@@ -238,7 +238,7 @@
           <w:szCs w:val="24"/>
           <w:lang w:val="en-AU"/>
         </w:rPr>
-        <w:t xml:space="preserve"> Using open data on 40,336 intensive care patients from two US hospitals (PhysioNet/CinC Challenge 2019), gradient-boosted sepsis models were imported between hospitals and into individual units (six scenarios). The proposed procedure, CAB (Calibrate, Adapt or Block), tests keeping, recalibrating and adapting the model in order of cost, activates an option only when exact binomial tests certify patient-level sensitivity and false-alert rate, and otherwise blocks it. CAB was compared with direct deployment, recalibration, fine-tuning, retraining and classical statistical updating across 250 to 12,000 labelled patients (100 repetitions per setting), and implemented in a prototype deployment and ward-monitoring application.</w:t>
+        <w:t xml:space="preserve"> Using data from 40,336 intensive care patients across two US hospitals in the PhysioNet/CinC Challenge 2019 dataset, gradient-boosted sepsis prediction models were transferred between hospitals and into individual intensive care units across six scenarios. CAB evaluates model retention, recalibration, and adaptation in order of increasing intervention, permitting activation only when exact binomial tests certify that prespecified sensitivity and false-alert-rate requirements are satisfied; otherwise, deployment is blocked. CAB was compared with direct deployment, recalibration, fine-tuning, retraining, and classical statistical updating using 250–12,000 labelled patients, with 100 repetitions per setting. A prototype deployment and ward-monitoring application was also implemented.</w:t>
       </w:r>
       <w:r>
         <w:rPr>
@@ -264,7 +264,7 @@
           <w:szCs w:val="24"/>
           <w:lang w:val="en-AU"/>
         </w:rPr>
-        <w:t xml:space="preserve"> Imported models failed differently by direction, detecting 63% of septic patients against an 80% target or doubling false alerts. Conventional and classical remedies activated unsafe models in 77–100% of runs, often while appearing safe on local data; CAB did so in under 1%. CAB blocked unrepairable models from 250 labelled patients and certified the adapted model in 97% of runs at 12,000 patients (about 690 septic cases), and a closed-form calculator predicted label requirements to within 20%.</w:t>
+        <w:t xml:space="preserve"> Imported models exhibited direction-dependent safety failures, with sensitivity falling to 63% against an 80% target or false-alert rates doubling. Conventional and classical updating methods activated models that failed the prespecified safety requirements in 77–100% of runs, whereas CAB did so in fewer than 1%. With as few as 250 labelled patients, CAB blocked models that could not be safely repaired, and it certified the adapted model in 97% of runs with 12,000 labelled patients, including approximately 690 septic cases. A closed-form calculator estimated the required number of labelled patients to within 20%.</w:t>
       </w:r>
       <w:r>
         <w:rPr>
@@ -290,7 +290,7 @@
           <w:szCs w:val="24"/>
           <w:lang w:val="en-AU"/>
         </w:rPr>
-        <w:t xml:space="preserve"> The research demonstrates a practical, certified deployment gate for imported clinical AI. Because typical local validation samples are too small, blocking should be a planned outcome and label collection should be planned before deployment.</w:t>
+        <w:t xml:space="preserve"> CAB provides a systematic approach to evaluating and updating imported clinical prediction models before deployment. The findings highlight that deployment rejection is a legitimate safety decision and that local data collection should be planned according to the statistical evidence required for certification.</w:t>
       </w:r>
     </w:p>
     <w:p>
@@ -330,7 +330,7 @@
           <w:szCs w:val="24"/>
           <w:lang w:val="en-AU"/>
         </w:rPr>
-        <w:t xml:space="preserve"> Sepsis Early Warning; Clinical Decision Support; Dataset Shift; Model Updating; Local Validation; Certified Safety; Health Informatics.</w:t>
+        <w:t xml:space="preserve"> Sepsis Early Warning; Clinical Decision Support; Dataset Shift; Model Updating; Local Validation; Statistical Certification; Health Informatics.</w:t>
       </w:r>
     </w:p>
     <w:sectPr>

</xml_diff>